<commit_message>
Updating Tutorial 3 Word answer
</commit_message>
<xml_diff>
--- a/TUTORIALS/TUTORIAL 3/T-1002-03.docx
+++ b/TUTORIALS/TUTORIAL 3/T-1002-03.docx
@@ -20,6 +20,9 @@
         <w:spacing w:after="0" w:line="259" w:lineRule="auto"/>
         <w:ind w:left="12"/>
         <w:jc w:val="center"/>
+        <w:rPr>
+          <w:b/>
+        </w:rPr>
       </w:pPr>
       <w:r>
         <w:rPr>
@@ -31,19 +34,74 @@
     <w:p>
       <w:pPr>
         <w:spacing w:after="0" w:line="259" w:lineRule="auto"/>
+        <w:ind w:left="12"/>
+        <w:rPr>
+          <w:b/>
+        </w:rPr>
+      </w:pPr>
+      <w:r>
+        <w:rPr>
+          <w:b/>
+        </w:rPr>
+        <w:t>Name: Muhammad Khairul Fitri bin Kader</w:t>
+      </w:r>
+    </w:p>
+    <w:p>
+      <w:pPr>
+        <w:spacing w:after="0" w:line="259" w:lineRule="auto"/>
+        <w:ind w:left="12"/>
+        <w:rPr>
+          <w:b/>
+        </w:rPr>
+      </w:pPr>
+      <w:proofErr w:type="spellStart"/>
+      <w:r>
+        <w:rPr>
+          <w:b/>
+        </w:rPr>
+        <w:t>Occ</w:t>
+      </w:r>
+      <w:proofErr w:type="spellEnd"/>
+      <w:r>
+        <w:rPr>
+          <w:b/>
+        </w:rPr>
+        <w:t>: 8</w:t>
+      </w:r>
+    </w:p>
+    <w:p>
+      <w:pPr>
+        <w:spacing w:after="0" w:line="259" w:lineRule="auto"/>
         <w:ind w:left="0" w:firstLine="0"/>
       </w:pPr>
       <w:r>
         <w:t xml:space="preserve"> </w:t>
       </w:r>
-    </w:p>
-    <w:p>
-      <w:pPr>
-        <w:numPr>
-          <w:ilvl w:val="0"/>
-          <w:numId w:val="1"/>
-        </w:numPr>
-        <w:ind w:hanging="360"/>
+      <w:r>
+        <w:t>GitHub Link (for executable code</w:t>
+      </w:r>
+      <w:r>
+        <w:t xml:space="preserve"> in java</w:t>
+      </w:r>
+      <w:r>
+        <w:t>):</w:t>
+      </w:r>
+      <w:r>
+        <w:t xml:space="preserve"> </w:t>
+      </w:r>
+      <w:hyperlink r:id="rId5" w:history="1">
+        <w:r>
+          <w:rPr>
+            <w:rStyle w:val="Hyperlink"/>
+          </w:rPr>
+          <w:t>https://github.com/mkhaifit08-eng/WIX1002-Activities-KhaiFit/tree/main/TUTORIALS/TUTORIAL%203</w:t>
+        </w:r>
+      </w:hyperlink>
+    </w:p>
+    <w:p>
+      <w:pPr>
+        <w:spacing w:after="0" w:line="259" w:lineRule="auto"/>
+        <w:ind w:left="0" w:firstLine="0"/>
       </w:pPr>
       <w:r>
         <w:t xml:space="preserve">Write statements for each of the following </w:t>
@@ -80,21 +138,72 @@
         <w:ind w:left="1080" w:firstLine="0"/>
       </w:pPr>
       <w:r>
-        <w:t>if (3*8 == 27) {</w:t>
-      </w:r>
-    </w:p>
-    <w:p>
-      <w:pPr>
-        <w:pBdr>
-          <w:top w:val="single" w:sz="4" w:space="1" w:color="auto"/>
-          <w:left w:val="single" w:sz="4" w:space="4" w:color="auto"/>
-          <w:bottom w:val="single" w:sz="4" w:space="1" w:color="auto"/>
-          <w:right w:val="single" w:sz="4" w:space="4" w:color="auto"/>
-        </w:pBdr>
-        <w:ind w:left="1080" w:firstLine="0"/>
-      </w:pPr>
-      <w:r>
-        <w:tab/>
+        <w:t xml:space="preserve">public class </w:t>
+      </w:r>
+      <w:proofErr w:type="gramStart"/>
+      <w:r>
+        <w:t>Main{</w:t>
+      </w:r>
+      <w:proofErr w:type="gramEnd"/>
+    </w:p>
+    <w:p>
+      <w:pPr>
+        <w:pBdr>
+          <w:top w:val="single" w:sz="4" w:space="1" w:color="auto"/>
+          <w:left w:val="single" w:sz="4" w:space="4" w:color="auto"/>
+          <w:bottom w:val="single" w:sz="4" w:space="1" w:color="auto"/>
+          <w:right w:val="single" w:sz="4" w:space="4" w:color="auto"/>
+        </w:pBdr>
+        <w:ind w:left="1080" w:firstLine="0"/>
+      </w:pPr>
+      <w:r>
+        <w:t>    public static void main (</w:t>
+      </w:r>
+      <w:proofErr w:type="gramStart"/>
+      <w:r>
+        <w:t>String[</w:t>
+      </w:r>
+      <w:proofErr w:type="gramEnd"/>
+      <w:r>
+        <w:t xml:space="preserve">] </w:t>
+      </w:r>
+      <w:proofErr w:type="spellStart"/>
+      <w:proofErr w:type="gramStart"/>
+      <w:r>
+        <w:t>args</w:t>
+      </w:r>
+      <w:proofErr w:type="spellEnd"/>
+      <w:r>
+        <w:t>){</w:t>
+      </w:r>
+      <w:proofErr w:type="gramEnd"/>
+    </w:p>
+    <w:p>
+      <w:pPr>
+        <w:pBdr>
+          <w:top w:val="single" w:sz="4" w:space="1" w:color="auto"/>
+          <w:left w:val="single" w:sz="4" w:space="4" w:color="auto"/>
+          <w:bottom w:val="single" w:sz="4" w:space="1" w:color="auto"/>
+          <w:right w:val="single" w:sz="4" w:space="4" w:color="auto"/>
+        </w:pBdr>
+        <w:ind w:left="1080" w:firstLine="0"/>
+      </w:pPr>
+      <w:r>
+        <w:t>        if (3*8 == 27) {</w:t>
+      </w:r>
+    </w:p>
+    <w:p>
+      <w:pPr>
+        <w:pBdr>
+          <w:top w:val="single" w:sz="4" w:space="1" w:color="auto"/>
+          <w:left w:val="single" w:sz="4" w:space="4" w:color="auto"/>
+          <w:bottom w:val="single" w:sz="4" w:space="1" w:color="auto"/>
+          <w:right w:val="single" w:sz="4" w:space="4" w:color="auto"/>
+        </w:pBdr>
+        <w:ind w:left="1080" w:firstLine="0"/>
+      </w:pPr>
+      <w:r>
+        <w:t xml:space="preserve">            </w:t>
       </w:r>
       <w:proofErr w:type="spellStart"/>
       <w:r>
@@ -102,35 +211,40 @@
       </w:r>
       <w:proofErr w:type="spellEnd"/>
       <w:r>
-        <w:t>("True");</w:t>
-      </w:r>
-    </w:p>
-    <w:p>
-      <w:pPr>
-        <w:pBdr>
-          <w:top w:val="single" w:sz="4" w:space="1" w:color="auto"/>
-          <w:left w:val="single" w:sz="4" w:space="4" w:color="auto"/>
-          <w:bottom w:val="single" w:sz="4" w:space="1" w:color="auto"/>
-          <w:right w:val="single" w:sz="4" w:space="4" w:color="auto"/>
-        </w:pBdr>
-        <w:ind w:left="1080" w:firstLine="0"/>
-      </w:pPr>
-      <w:r>
-        <w:t>} else {</w:t>
-      </w:r>
-    </w:p>
-    <w:p>
-      <w:pPr>
-        <w:pBdr>
-          <w:top w:val="single" w:sz="4" w:space="1" w:color="auto"/>
-          <w:left w:val="single" w:sz="4" w:space="4" w:color="auto"/>
-          <w:bottom w:val="single" w:sz="4" w:space="1" w:color="auto"/>
-          <w:right w:val="single" w:sz="4" w:space="4" w:color="auto"/>
-        </w:pBdr>
-        <w:ind w:left="1080" w:firstLine="0"/>
-      </w:pPr>
-      <w:r>
-        <w:tab/>
+        <w:t>("True"</w:t>
+      </w:r>
+      <w:proofErr w:type="gramStart"/>
+      <w:r>
+        <w:t>);</w:t>
+      </w:r>
+      <w:proofErr w:type="gramEnd"/>
+    </w:p>
+    <w:p>
+      <w:pPr>
+        <w:pBdr>
+          <w:top w:val="single" w:sz="4" w:space="1" w:color="auto"/>
+          <w:left w:val="single" w:sz="4" w:space="4" w:color="auto"/>
+          <w:bottom w:val="single" w:sz="4" w:space="1" w:color="auto"/>
+          <w:right w:val="single" w:sz="4" w:space="4" w:color="auto"/>
+        </w:pBdr>
+        <w:ind w:left="1080" w:firstLine="0"/>
+      </w:pPr>
+      <w:r>
+        <w:t>        } else {</w:t>
+      </w:r>
+    </w:p>
+    <w:p>
+      <w:pPr>
+        <w:pBdr>
+          <w:top w:val="single" w:sz="4" w:space="1" w:color="auto"/>
+          <w:left w:val="single" w:sz="4" w:space="4" w:color="auto"/>
+          <w:bottom w:val="single" w:sz="4" w:space="1" w:color="auto"/>
+          <w:right w:val="single" w:sz="4" w:space="4" w:color="auto"/>
+        </w:pBdr>
+        <w:ind w:left="1080" w:firstLine="0"/>
+      </w:pPr>
+      <w:r>
+        <w:t xml:space="preserve">            </w:t>
       </w:r>
       <w:proofErr w:type="spellStart"/>
       <w:r>
@@ -138,7 +252,51 @@
       </w:r>
       <w:proofErr w:type="spellEnd"/>
       <w:r>
-        <w:t>(False);</w:t>
+        <w:t>("False"</w:t>
+      </w:r>
+      <w:proofErr w:type="gramStart"/>
+      <w:r>
+        <w:t>);</w:t>
+      </w:r>
+      <w:proofErr w:type="gramEnd"/>
+    </w:p>
+    <w:p>
+      <w:pPr>
+        <w:pBdr>
+          <w:top w:val="single" w:sz="4" w:space="1" w:color="auto"/>
+          <w:left w:val="single" w:sz="4" w:space="4" w:color="auto"/>
+          <w:bottom w:val="single" w:sz="4" w:space="1" w:color="auto"/>
+          <w:right w:val="single" w:sz="4" w:space="4" w:color="auto"/>
+        </w:pBdr>
+        <w:ind w:left="1080" w:firstLine="0"/>
+      </w:pPr>
+      <w:r>
+        <w:t>        }</w:t>
+      </w:r>
+    </w:p>
+    <w:p>
+      <w:pPr>
+        <w:pBdr>
+          <w:top w:val="single" w:sz="4" w:space="1" w:color="auto"/>
+          <w:left w:val="single" w:sz="4" w:space="4" w:color="auto"/>
+          <w:bottom w:val="single" w:sz="4" w:space="1" w:color="auto"/>
+          <w:right w:val="single" w:sz="4" w:space="4" w:color="auto"/>
+        </w:pBdr>
+        <w:ind w:left="1080" w:firstLine="0"/>
+      </w:pPr>
+    </w:p>
+    <w:p>
+      <w:pPr>
+        <w:pBdr>
+          <w:top w:val="single" w:sz="4" w:space="1" w:color="auto"/>
+          <w:left w:val="single" w:sz="4" w:space="4" w:color="auto"/>
+          <w:bottom w:val="single" w:sz="4" w:space="1" w:color="auto"/>
+          <w:right w:val="single" w:sz="4" w:space="4" w:color="auto"/>
+        </w:pBdr>
+        <w:ind w:left="1080" w:firstLine="0"/>
+      </w:pPr>
+      <w:r>
+        <w:t>    }</w:t>
       </w:r>
     </w:p>
     <w:p>
@@ -194,18 +352,220 @@
         <w:ind w:left="1080" w:firstLine="0"/>
       </w:pPr>
       <w:r>
-        <w:t>if (x %2==</w:t>
+        <w:t xml:space="preserve">import </w:t>
+      </w:r>
+      <w:proofErr w:type="spellStart"/>
+      <w:proofErr w:type="gramStart"/>
+      <w:r>
+        <w:t>java.util</w:t>
+      </w:r>
+      <w:proofErr w:type="gramEnd"/>
+      <w:r>
+        <w:t>.</w:t>
+      </w:r>
+      <w:proofErr w:type="gramStart"/>
+      <w:r>
+        <w:t>Scanner</w:t>
+      </w:r>
+      <w:proofErr w:type="spellEnd"/>
+      <w:r>
+        <w:t>;</w:t>
+      </w:r>
+      <w:proofErr w:type="gramEnd"/>
+    </w:p>
+    <w:p>
+      <w:pPr>
+        <w:pBdr>
+          <w:top w:val="single" w:sz="4" w:space="1" w:color="auto"/>
+          <w:left w:val="single" w:sz="4" w:space="4" w:color="auto"/>
+          <w:bottom w:val="single" w:sz="4" w:space="1" w:color="auto"/>
+          <w:right w:val="single" w:sz="4" w:space="4" w:color="auto"/>
+        </w:pBdr>
+        <w:ind w:left="1080" w:firstLine="0"/>
+      </w:pPr>
+    </w:p>
+    <w:p>
+      <w:pPr>
+        <w:pBdr>
+          <w:top w:val="single" w:sz="4" w:space="1" w:color="auto"/>
+          <w:left w:val="single" w:sz="4" w:space="4" w:color="auto"/>
+          <w:bottom w:val="single" w:sz="4" w:space="1" w:color="auto"/>
+          <w:right w:val="single" w:sz="4" w:space="4" w:color="auto"/>
+        </w:pBdr>
+        <w:ind w:left="1080" w:firstLine="0"/>
+      </w:pPr>
+      <w:r>
+        <w:t>public class T3Q1b {</w:t>
+      </w:r>
+    </w:p>
+    <w:p>
+      <w:pPr>
+        <w:pBdr>
+          <w:top w:val="single" w:sz="4" w:space="1" w:color="auto"/>
+          <w:left w:val="single" w:sz="4" w:space="4" w:color="auto"/>
+          <w:bottom w:val="single" w:sz="4" w:space="1" w:color="auto"/>
+          <w:right w:val="single" w:sz="4" w:space="4" w:color="auto"/>
+        </w:pBdr>
+        <w:ind w:left="1080" w:firstLine="0"/>
+      </w:pPr>
+      <w:r>
+        <w:t xml:space="preserve">    public static void </w:t>
+      </w:r>
+      <w:proofErr w:type="gramStart"/>
+      <w:r>
+        <w:t>main(String[</w:t>
+      </w:r>
+      <w:proofErr w:type="gramEnd"/>
+      <w:r>
+        <w:t xml:space="preserve">] </w:t>
+      </w:r>
+      <w:proofErr w:type="spellStart"/>
+      <w:proofErr w:type="gramStart"/>
+      <w:r>
+        <w:t>Args</w:t>
+      </w:r>
+      <w:proofErr w:type="spellEnd"/>
+      <w:r>
+        <w:t>){</w:t>
+      </w:r>
+      <w:proofErr w:type="gramEnd"/>
+    </w:p>
+    <w:p>
+      <w:pPr>
+        <w:pBdr>
+          <w:top w:val="single" w:sz="4" w:space="1" w:color="auto"/>
+          <w:left w:val="single" w:sz="4" w:space="4" w:color="auto"/>
+          <w:bottom w:val="single" w:sz="4" w:space="1" w:color="auto"/>
+          <w:right w:val="single" w:sz="4" w:space="4" w:color="auto"/>
+        </w:pBdr>
+        <w:ind w:left="1080" w:firstLine="0"/>
+      </w:pPr>
+      <w:r>
+        <w:t xml:space="preserve">        Scanner input = new </w:t>
+      </w:r>
+      <w:proofErr w:type="gramStart"/>
+      <w:r>
+        <w:t>Scanner(</w:t>
+      </w:r>
+      <w:proofErr w:type="gramEnd"/>
+      <w:r>
+        <w:t>System.in</w:t>
+      </w:r>
+      <w:proofErr w:type="gramStart"/>
+      <w:r>
+        <w:t>);</w:t>
+      </w:r>
+      <w:proofErr w:type="gramEnd"/>
+    </w:p>
+    <w:p>
+      <w:pPr>
+        <w:pBdr>
+          <w:top w:val="single" w:sz="4" w:space="1" w:color="auto"/>
+          <w:left w:val="single" w:sz="4" w:space="4" w:color="auto"/>
+          <w:bottom w:val="single" w:sz="4" w:space="1" w:color="auto"/>
+          <w:right w:val="single" w:sz="4" w:space="4" w:color="auto"/>
+        </w:pBdr>
+        <w:ind w:left="1080" w:firstLine="0"/>
+      </w:pPr>
+    </w:p>
+    <w:p>
+      <w:pPr>
+        <w:pBdr>
+          <w:top w:val="single" w:sz="4" w:space="1" w:color="auto"/>
+          <w:left w:val="single" w:sz="4" w:space="4" w:color="auto"/>
+          <w:bottom w:val="single" w:sz="4" w:space="1" w:color="auto"/>
+          <w:right w:val="single" w:sz="4" w:space="4" w:color="auto"/>
+        </w:pBdr>
+        <w:ind w:left="1080" w:firstLine="0"/>
+      </w:pPr>
+      <w:r>
+        <w:t xml:space="preserve">        </w:t>
+      </w:r>
+      <w:proofErr w:type="spellStart"/>
+      <w:r>
+        <w:t>System.out.print</w:t>
+      </w:r>
+      <w:proofErr w:type="spellEnd"/>
+      <w:r>
+        <w:t>("Enter a number: "</w:t>
+      </w:r>
+      <w:proofErr w:type="gramStart"/>
+      <w:r>
+        <w:t>);</w:t>
+      </w:r>
+      <w:proofErr w:type="gramEnd"/>
+    </w:p>
+    <w:p>
+      <w:pPr>
+        <w:pBdr>
+          <w:top w:val="single" w:sz="4" w:space="1" w:color="auto"/>
+          <w:left w:val="single" w:sz="4" w:space="4" w:color="auto"/>
+          <w:bottom w:val="single" w:sz="4" w:space="1" w:color="auto"/>
+          <w:right w:val="single" w:sz="4" w:space="4" w:color="auto"/>
+        </w:pBdr>
+        <w:ind w:left="1080" w:firstLine="0"/>
+      </w:pPr>
+      <w:r>
+        <w:t xml:space="preserve">        int x= </w:t>
+      </w:r>
+      <w:proofErr w:type="spellStart"/>
+      <w:proofErr w:type="gramStart"/>
+      <w:r>
+        <w:t>input.nextInt</w:t>
+      </w:r>
+      <w:proofErr w:type="spellEnd"/>
+      <w:proofErr w:type="gramEnd"/>
+      <w:r>
+        <w:t>(</w:t>
+      </w:r>
+      <w:proofErr w:type="gramStart"/>
+      <w:r>
+        <w:t>);</w:t>
+      </w:r>
+      <w:proofErr w:type="gramEnd"/>
+    </w:p>
+    <w:p>
+      <w:pPr>
+        <w:pBdr>
+          <w:top w:val="single" w:sz="4" w:space="1" w:color="auto"/>
+          <w:left w:val="single" w:sz="4" w:space="4" w:color="auto"/>
+          <w:bottom w:val="single" w:sz="4" w:space="1" w:color="auto"/>
+          <w:right w:val="single" w:sz="4" w:space="4" w:color="auto"/>
+        </w:pBdr>
+        <w:ind w:left="1080" w:firstLine="0"/>
+      </w:pPr>
+    </w:p>
+    <w:p>
+      <w:pPr>
+        <w:pBdr>
+          <w:top w:val="single" w:sz="4" w:space="1" w:color="auto"/>
+          <w:left w:val="single" w:sz="4" w:space="4" w:color="auto"/>
+          <w:bottom w:val="single" w:sz="4" w:space="1" w:color="auto"/>
+          <w:right w:val="single" w:sz="4" w:space="4" w:color="auto"/>
+        </w:pBdr>
+        <w:ind w:left="1080" w:firstLine="0"/>
+      </w:pPr>
+      <w:r>
+        <w:t>        if (x %2==</w:t>
       </w:r>
       <w:proofErr w:type="gramStart"/>
       <w:r>
         <w:t>0){</w:t>
       </w:r>
       <w:proofErr w:type="gramEnd"/>
-      <w:r>
-        <w:br/>
-      </w:r>
-      <w:r>
-        <w:tab/>
+    </w:p>
+    <w:p>
+      <w:pPr>
+        <w:pBdr>
+          <w:top w:val="single" w:sz="4" w:space="1" w:color="auto"/>
+          <w:left w:val="single" w:sz="4" w:space="4" w:color="auto"/>
+          <w:bottom w:val="single" w:sz="4" w:space="1" w:color="auto"/>
+          <w:right w:val="single" w:sz="4" w:space="4" w:color="auto"/>
+        </w:pBdr>
+        <w:ind w:left="1080" w:firstLine="0"/>
+      </w:pPr>
+      <w:r>
+        <w:t xml:space="preserve">            </w:t>
       </w:r>
       <w:proofErr w:type="spellStart"/>
       <w:r>
@@ -213,27 +573,40 @@
       </w:r>
       <w:proofErr w:type="spellEnd"/>
       <w:r>
-        <w:t>("True");</w:t>
-      </w:r>
-    </w:p>
-    <w:p>
-      <w:pPr>
-        <w:pBdr>
-          <w:top w:val="single" w:sz="4" w:space="1" w:color="auto"/>
-          <w:left w:val="single" w:sz="4" w:space="4" w:color="auto"/>
-          <w:bottom w:val="single" w:sz="4" w:space="1" w:color="auto"/>
-          <w:right w:val="single" w:sz="4" w:space="4" w:color="auto"/>
-        </w:pBdr>
-        <w:ind w:left="1080" w:firstLine="0"/>
-      </w:pPr>
-      <w:r>
-        <w:t>} else {</w:t>
-      </w:r>
-      <w:r>
-        <w:br/>
-      </w:r>
-      <w:r>
-        <w:tab/>
+        <w:t>("Even"</w:t>
+      </w:r>
+      <w:proofErr w:type="gramStart"/>
+      <w:r>
+        <w:t>);</w:t>
+      </w:r>
+      <w:proofErr w:type="gramEnd"/>
+    </w:p>
+    <w:p>
+      <w:pPr>
+        <w:pBdr>
+          <w:top w:val="single" w:sz="4" w:space="1" w:color="auto"/>
+          <w:left w:val="single" w:sz="4" w:space="4" w:color="auto"/>
+          <w:bottom w:val="single" w:sz="4" w:space="1" w:color="auto"/>
+          <w:right w:val="single" w:sz="4" w:space="4" w:color="auto"/>
+        </w:pBdr>
+        <w:ind w:left="1080" w:firstLine="0"/>
+      </w:pPr>
+      <w:r>
+        <w:t>        } else {</w:t>
+      </w:r>
+    </w:p>
+    <w:p>
+      <w:pPr>
+        <w:pBdr>
+          <w:top w:val="single" w:sz="4" w:space="1" w:color="auto"/>
+          <w:left w:val="single" w:sz="4" w:space="4" w:color="auto"/>
+          <w:bottom w:val="single" w:sz="4" w:space="1" w:color="auto"/>
+          <w:right w:val="single" w:sz="4" w:space="4" w:color="auto"/>
+        </w:pBdr>
+        <w:ind w:left="1080" w:firstLine="0"/>
+      </w:pPr>
+      <w:r>
+        <w:t xml:space="preserve">            </w:t>
       </w:r>
       <w:proofErr w:type="spellStart"/>
       <w:r>
@@ -241,7 +614,80 @@
       </w:r>
       <w:proofErr w:type="spellEnd"/>
       <w:r>
-        <w:t>("False");</w:t>
+        <w:t>("Odd"</w:t>
+      </w:r>
+      <w:proofErr w:type="gramStart"/>
+      <w:r>
+        <w:t>);</w:t>
+      </w:r>
+      <w:proofErr w:type="gramEnd"/>
+    </w:p>
+    <w:p>
+      <w:pPr>
+        <w:pBdr>
+          <w:top w:val="single" w:sz="4" w:space="1" w:color="auto"/>
+          <w:left w:val="single" w:sz="4" w:space="4" w:color="auto"/>
+          <w:bottom w:val="single" w:sz="4" w:space="1" w:color="auto"/>
+          <w:right w:val="single" w:sz="4" w:space="4" w:color="auto"/>
+        </w:pBdr>
+        <w:ind w:left="1080" w:firstLine="0"/>
+      </w:pPr>
+      <w:r>
+        <w:t>        }</w:t>
+      </w:r>
+    </w:p>
+    <w:p>
+      <w:pPr>
+        <w:pBdr>
+          <w:top w:val="single" w:sz="4" w:space="1" w:color="auto"/>
+          <w:left w:val="single" w:sz="4" w:space="4" w:color="auto"/>
+          <w:bottom w:val="single" w:sz="4" w:space="1" w:color="auto"/>
+          <w:right w:val="single" w:sz="4" w:space="4" w:color="auto"/>
+        </w:pBdr>
+        <w:ind w:left="1080" w:firstLine="0"/>
+      </w:pPr>
+    </w:p>
+    <w:p>
+      <w:pPr>
+        <w:pBdr>
+          <w:top w:val="single" w:sz="4" w:space="1" w:color="auto"/>
+          <w:left w:val="single" w:sz="4" w:space="4" w:color="auto"/>
+          <w:bottom w:val="single" w:sz="4" w:space="1" w:color="auto"/>
+          <w:right w:val="single" w:sz="4" w:space="4" w:color="auto"/>
+        </w:pBdr>
+        <w:ind w:left="1080" w:firstLine="0"/>
+      </w:pPr>
+      <w:r>
+        <w:t xml:space="preserve">        </w:t>
+      </w:r>
+      <w:proofErr w:type="spellStart"/>
+      <w:proofErr w:type="gramStart"/>
+      <w:r>
+        <w:t>input.close</w:t>
+      </w:r>
+      <w:proofErr w:type="spellEnd"/>
+      <w:proofErr w:type="gramEnd"/>
+      <w:r>
+        <w:t>(</w:t>
+      </w:r>
+      <w:proofErr w:type="gramStart"/>
+      <w:r>
+        <w:t>);</w:t>
+      </w:r>
+      <w:proofErr w:type="gramEnd"/>
+    </w:p>
+    <w:p>
+      <w:pPr>
+        <w:pBdr>
+          <w:top w:val="single" w:sz="4" w:space="1" w:color="auto"/>
+          <w:left w:val="single" w:sz="4" w:space="4" w:color="auto"/>
+          <w:bottom w:val="single" w:sz="4" w:space="1" w:color="auto"/>
+          <w:right w:val="single" w:sz="4" w:space="4" w:color="auto"/>
+        </w:pBdr>
+        <w:ind w:left="1080" w:firstLine="0"/>
+      </w:pPr>
+      <w:r>
+        <w:t>    }</w:t>
       </w:r>
     </w:p>
     <w:p>
@@ -280,11 +726,18 @@
         <w:ind w:left="1080" w:firstLine="0"/>
       </w:pPr>
       <w:r>
+        <w:lastRenderedPageBreak/>
         <w:t>Answer:</w:t>
       </w:r>
     </w:p>
     <w:p>
       <w:pPr>
+        <w:pBdr>
+          <w:top w:val="single" w:sz="4" w:space="1" w:color="auto"/>
+          <w:left w:val="single" w:sz="4" w:space="4" w:color="auto"/>
+          <w:bottom w:val="single" w:sz="4" w:space="1" w:color="auto"/>
+          <w:right w:val="single" w:sz="4" w:space="4" w:color="auto"/>
+        </w:pBdr>
         <w:ind w:left="1080" w:firstLine="0"/>
       </w:pPr>
       <w:r>
@@ -309,6 +762,12 @@
     </w:p>
     <w:p>
       <w:pPr>
+        <w:pBdr>
+          <w:top w:val="single" w:sz="4" w:space="1" w:color="auto"/>
+          <w:left w:val="single" w:sz="4" w:space="4" w:color="auto"/>
+          <w:bottom w:val="single" w:sz="4" w:space="1" w:color="auto"/>
+          <w:right w:val="single" w:sz="4" w:space="4" w:color="auto"/>
+        </w:pBdr>
         <w:ind w:left="1080" w:firstLine="360"/>
       </w:pPr>
       <w:proofErr w:type="spellStart"/>
@@ -336,6 +795,12 @@
     </w:p>
     <w:p>
       <w:pPr>
+        <w:pBdr>
+          <w:top w:val="single" w:sz="4" w:space="1" w:color="auto"/>
+          <w:left w:val="single" w:sz="4" w:space="4" w:color="auto"/>
+          <w:bottom w:val="single" w:sz="4" w:space="1" w:color="auto"/>
+          <w:right w:val="single" w:sz="4" w:space="4" w:color="auto"/>
+        </w:pBdr>
         <w:ind w:left="1080" w:firstLine="360"/>
       </w:pPr>
       <w:proofErr w:type="spellStart"/>
@@ -357,6 +822,12 @@
     </w:p>
     <w:p>
       <w:pPr>
+        <w:pBdr>
+          <w:top w:val="single" w:sz="4" w:space="1" w:color="auto"/>
+          <w:left w:val="single" w:sz="4" w:space="4" w:color="auto"/>
+          <w:bottom w:val="single" w:sz="4" w:space="1" w:color="auto"/>
+          <w:right w:val="single" w:sz="4" w:space="4" w:color="auto"/>
+        </w:pBdr>
         <w:ind w:left="1080" w:firstLine="0"/>
       </w:pPr>
       <w:r>
@@ -384,6 +855,491 @@
       <w:pPr>
         <w:ind w:left="1080" w:firstLine="0"/>
       </w:pPr>
+      <w:r>
+        <w:t>Answer:</w:t>
+      </w:r>
+    </w:p>
+    <w:p>
+      <w:pPr>
+        <w:pBdr>
+          <w:top w:val="single" w:sz="4" w:space="1" w:color="auto"/>
+          <w:left w:val="single" w:sz="4" w:space="4" w:color="auto"/>
+          <w:bottom w:val="single" w:sz="4" w:space="1" w:color="auto"/>
+          <w:right w:val="single" w:sz="4" w:space="4" w:color="auto"/>
+        </w:pBdr>
+        <w:ind w:left="1080" w:firstLine="0"/>
+      </w:pPr>
+      <w:r>
+        <w:t xml:space="preserve">import </w:t>
+      </w:r>
+      <w:proofErr w:type="spellStart"/>
+      <w:proofErr w:type="gramStart"/>
+      <w:r>
+        <w:t>java.util</w:t>
+      </w:r>
+      <w:proofErr w:type="gramEnd"/>
+      <w:r>
+        <w:t>.</w:t>
+      </w:r>
+      <w:proofErr w:type="gramStart"/>
+      <w:r>
+        <w:t>Scanner</w:t>
+      </w:r>
+      <w:proofErr w:type="spellEnd"/>
+      <w:r>
+        <w:t>;</w:t>
+      </w:r>
+      <w:proofErr w:type="gramEnd"/>
+    </w:p>
+    <w:p>
+      <w:pPr>
+        <w:pBdr>
+          <w:top w:val="single" w:sz="4" w:space="1" w:color="auto"/>
+          <w:left w:val="single" w:sz="4" w:space="4" w:color="auto"/>
+          <w:bottom w:val="single" w:sz="4" w:space="1" w:color="auto"/>
+          <w:right w:val="single" w:sz="4" w:space="4" w:color="auto"/>
+        </w:pBdr>
+        <w:ind w:left="1080" w:firstLine="0"/>
+      </w:pPr>
+    </w:p>
+    <w:p>
+      <w:pPr>
+        <w:pBdr>
+          <w:top w:val="single" w:sz="4" w:space="1" w:color="auto"/>
+          <w:left w:val="single" w:sz="4" w:space="4" w:color="auto"/>
+          <w:bottom w:val="single" w:sz="4" w:space="1" w:color="auto"/>
+          <w:right w:val="single" w:sz="4" w:space="4" w:color="auto"/>
+        </w:pBdr>
+        <w:ind w:left="1080" w:firstLine="0"/>
+      </w:pPr>
+      <w:r>
+        <w:t>public class T3Q1d {</w:t>
+      </w:r>
+    </w:p>
+    <w:p>
+      <w:pPr>
+        <w:pBdr>
+          <w:top w:val="single" w:sz="4" w:space="1" w:color="auto"/>
+          <w:left w:val="single" w:sz="4" w:space="4" w:color="auto"/>
+          <w:bottom w:val="single" w:sz="4" w:space="1" w:color="auto"/>
+          <w:right w:val="single" w:sz="4" w:space="4" w:color="auto"/>
+        </w:pBdr>
+        <w:ind w:left="1080" w:firstLine="0"/>
+      </w:pPr>
+      <w:r>
+        <w:t xml:space="preserve">    public static void </w:t>
+      </w:r>
+      <w:proofErr w:type="gramStart"/>
+      <w:r>
+        <w:t>main(String[</w:t>
+      </w:r>
+      <w:proofErr w:type="gramEnd"/>
+      <w:r>
+        <w:t xml:space="preserve">] </w:t>
+      </w:r>
+      <w:proofErr w:type="spellStart"/>
+      <w:r>
+        <w:t>args</w:t>
+      </w:r>
+      <w:proofErr w:type="spellEnd"/>
+      <w:r>
+        <w:t>) {</w:t>
+      </w:r>
+    </w:p>
+    <w:p>
+      <w:pPr>
+        <w:pBdr>
+          <w:top w:val="single" w:sz="4" w:space="1" w:color="auto"/>
+          <w:left w:val="single" w:sz="4" w:space="4" w:color="auto"/>
+          <w:bottom w:val="single" w:sz="4" w:space="1" w:color="auto"/>
+          <w:right w:val="single" w:sz="4" w:space="4" w:color="auto"/>
+        </w:pBdr>
+        <w:ind w:left="1080" w:firstLine="0"/>
+      </w:pPr>
+      <w:r>
+        <w:t xml:space="preserve">        Scanner input = new </w:t>
+      </w:r>
+      <w:proofErr w:type="gramStart"/>
+      <w:r>
+        <w:t>Scanner(</w:t>
+      </w:r>
+      <w:proofErr w:type="gramEnd"/>
+      <w:r>
+        <w:t>System.in</w:t>
+      </w:r>
+      <w:proofErr w:type="gramStart"/>
+      <w:r>
+        <w:t>);</w:t>
+      </w:r>
+      <w:proofErr w:type="gramEnd"/>
+    </w:p>
+    <w:p>
+      <w:pPr>
+        <w:pBdr>
+          <w:top w:val="single" w:sz="4" w:space="1" w:color="auto"/>
+          <w:left w:val="single" w:sz="4" w:space="4" w:color="auto"/>
+          <w:bottom w:val="single" w:sz="4" w:space="1" w:color="auto"/>
+          <w:right w:val="single" w:sz="4" w:space="4" w:color="auto"/>
+        </w:pBdr>
+        <w:ind w:left="1080" w:firstLine="0"/>
+      </w:pPr>
+    </w:p>
+    <w:p>
+      <w:pPr>
+        <w:pBdr>
+          <w:top w:val="single" w:sz="4" w:space="1" w:color="auto"/>
+          <w:left w:val="single" w:sz="4" w:space="4" w:color="auto"/>
+          <w:bottom w:val="single" w:sz="4" w:space="1" w:color="auto"/>
+          <w:right w:val="single" w:sz="4" w:space="4" w:color="auto"/>
+        </w:pBdr>
+        <w:ind w:left="1080" w:firstLine="0"/>
+      </w:pPr>
+      <w:r>
+        <w:t xml:space="preserve">        </w:t>
+      </w:r>
+      <w:proofErr w:type="spellStart"/>
+      <w:r>
+        <w:t>System.out.print</w:t>
+      </w:r>
+      <w:proofErr w:type="spellEnd"/>
+      <w:r>
+        <w:t>("Enter the first string: "</w:t>
+      </w:r>
+      <w:proofErr w:type="gramStart"/>
+      <w:r>
+        <w:t>);</w:t>
+      </w:r>
+      <w:proofErr w:type="gramEnd"/>
+    </w:p>
+    <w:p>
+      <w:pPr>
+        <w:pBdr>
+          <w:top w:val="single" w:sz="4" w:space="1" w:color="auto"/>
+          <w:left w:val="single" w:sz="4" w:space="4" w:color="auto"/>
+          <w:bottom w:val="single" w:sz="4" w:space="1" w:color="auto"/>
+          <w:right w:val="single" w:sz="4" w:space="4" w:color="auto"/>
+        </w:pBdr>
+        <w:ind w:left="1080" w:firstLine="0"/>
+      </w:pPr>
+      <w:r>
+        <w:t xml:space="preserve">        String string1 = </w:t>
+      </w:r>
+      <w:proofErr w:type="spellStart"/>
+      <w:proofErr w:type="gramStart"/>
+      <w:r>
+        <w:t>input.nextLine</w:t>
+      </w:r>
+      <w:proofErr w:type="spellEnd"/>
+      <w:proofErr w:type="gramEnd"/>
+      <w:r>
+        <w:t>(</w:t>
+      </w:r>
+      <w:proofErr w:type="gramStart"/>
+      <w:r>
+        <w:t>);</w:t>
+      </w:r>
+      <w:proofErr w:type="gramEnd"/>
+    </w:p>
+    <w:p>
+      <w:pPr>
+        <w:pBdr>
+          <w:top w:val="single" w:sz="4" w:space="1" w:color="auto"/>
+          <w:left w:val="single" w:sz="4" w:space="4" w:color="auto"/>
+          <w:bottom w:val="single" w:sz="4" w:space="1" w:color="auto"/>
+          <w:right w:val="single" w:sz="4" w:space="4" w:color="auto"/>
+        </w:pBdr>
+        <w:ind w:left="1080" w:firstLine="0"/>
+      </w:pPr>
+    </w:p>
+    <w:p>
+      <w:pPr>
+        <w:pBdr>
+          <w:top w:val="single" w:sz="4" w:space="1" w:color="auto"/>
+          <w:left w:val="single" w:sz="4" w:space="4" w:color="auto"/>
+          <w:bottom w:val="single" w:sz="4" w:space="1" w:color="auto"/>
+          <w:right w:val="single" w:sz="4" w:space="4" w:color="auto"/>
+        </w:pBdr>
+        <w:ind w:left="1080" w:firstLine="0"/>
+      </w:pPr>
+      <w:r>
+        <w:t xml:space="preserve">        </w:t>
+      </w:r>
+      <w:proofErr w:type="spellStart"/>
+      <w:r>
+        <w:t>System.out.print</w:t>
+      </w:r>
+      <w:proofErr w:type="spellEnd"/>
+      <w:r>
+        <w:t>("Enter the second string: "</w:t>
+      </w:r>
+      <w:proofErr w:type="gramStart"/>
+      <w:r>
+        <w:t>);</w:t>
+      </w:r>
+      <w:proofErr w:type="gramEnd"/>
+    </w:p>
+    <w:p>
+      <w:pPr>
+        <w:pBdr>
+          <w:top w:val="single" w:sz="4" w:space="1" w:color="auto"/>
+          <w:left w:val="single" w:sz="4" w:space="4" w:color="auto"/>
+          <w:bottom w:val="single" w:sz="4" w:space="1" w:color="auto"/>
+          <w:right w:val="single" w:sz="4" w:space="4" w:color="auto"/>
+        </w:pBdr>
+        <w:ind w:left="1080" w:firstLine="0"/>
+      </w:pPr>
+      <w:r>
+        <w:t xml:space="preserve">        String string2 = </w:t>
+      </w:r>
+      <w:proofErr w:type="spellStart"/>
+      <w:proofErr w:type="gramStart"/>
+      <w:r>
+        <w:t>input.nextLine</w:t>
+      </w:r>
+      <w:proofErr w:type="spellEnd"/>
+      <w:proofErr w:type="gramEnd"/>
+      <w:r>
+        <w:t>(</w:t>
+      </w:r>
+      <w:proofErr w:type="gramStart"/>
+      <w:r>
+        <w:t>);</w:t>
+      </w:r>
+      <w:proofErr w:type="gramEnd"/>
+    </w:p>
+    <w:p>
+      <w:pPr>
+        <w:pBdr>
+          <w:top w:val="single" w:sz="4" w:space="1" w:color="auto"/>
+          <w:left w:val="single" w:sz="4" w:space="4" w:color="auto"/>
+          <w:bottom w:val="single" w:sz="4" w:space="1" w:color="auto"/>
+          <w:right w:val="single" w:sz="4" w:space="4" w:color="auto"/>
+        </w:pBdr>
+        <w:ind w:left="1080" w:firstLine="0"/>
+      </w:pPr>
+    </w:p>
+    <w:p>
+      <w:pPr>
+        <w:pBdr>
+          <w:top w:val="single" w:sz="4" w:space="1" w:color="auto"/>
+          <w:left w:val="single" w:sz="4" w:space="4" w:color="auto"/>
+          <w:bottom w:val="single" w:sz="4" w:space="1" w:color="auto"/>
+          <w:right w:val="single" w:sz="4" w:space="4" w:color="auto"/>
+        </w:pBdr>
+        <w:ind w:left="1080" w:firstLine="0"/>
+      </w:pPr>
+      <w:r>
+        <w:t>        if (string1.compareToIgnoreCase(string2) &lt;= 0) {</w:t>
+      </w:r>
+    </w:p>
+    <w:p>
+      <w:pPr>
+        <w:pBdr>
+          <w:top w:val="single" w:sz="4" w:space="1" w:color="auto"/>
+          <w:left w:val="single" w:sz="4" w:space="4" w:color="auto"/>
+          <w:bottom w:val="single" w:sz="4" w:space="1" w:color="auto"/>
+          <w:right w:val="single" w:sz="4" w:space="4" w:color="auto"/>
+        </w:pBdr>
+        <w:ind w:left="1080" w:firstLine="0"/>
+      </w:pPr>
+      <w:r>
+        <w:t xml:space="preserve">            </w:t>
+      </w:r>
+      <w:proofErr w:type="spellStart"/>
+      <w:r>
+        <w:t>System.out.println</w:t>
+      </w:r>
+      <w:proofErr w:type="spellEnd"/>
+      <w:r>
+        <w:t>(string1</w:t>
+      </w:r>
+      <w:proofErr w:type="gramStart"/>
+      <w:r>
+        <w:t>);</w:t>
+      </w:r>
+      <w:proofErr w:type="gramEnd"/>
+    </w:p>
+    <w:p>
+      <w:pPr>
+        <w:pBdr>
+          <w:top w:val="single" w:sz="4" w:space="1" w:color="auto"/>
+          <w:left w:val="single" w:sz="4" w:space="4" w:color="auto"/>
+          <w:bottom w:val="single" w:sz="4" w:space="1" w:color="auto"/>
+          <w:right w:val="single" w:sz="4" w:space="4" w:color="auto"/>
+        </w:pBdr>
+        <w:ind w:left="1080" w:firstLine="0"/>
+      </w:pPr>
+      <w:r>
+        <w:t xml:space="preserve">            </w:t>
+      </w:r>
+      <w:proofErr w:type="spellStart"/>
+      <w:r>
+        <w:t>System.out.println</w:t>
+      </w:r>
+      <w:proofErr w:type="spellEnd"/>
+      <w:r>
+        <w:t>(string2</w:t>
+      </w:r>
+      <w:proofErr w:type="gramStart"/>
+      <w:r>
+        <w:t>);</w:t>
+      </w:r>
+      <w:proofErr w:type="gramEnd"/>
+    </w:p>
+    <w:p>
+      <w:pPr>
+        <w:pBdr>
+          <w:top w:val="single" w:sz="4" w:space="1" w:color="auto"/>
+          <w:left w:val="single" w:sz="4" w:space="4" w:color="auto"/>
+          <w:bottom w:val="single" w:sz="4" w:space="1" w:color="auto"/>
+          <w:right w:val="single" w:sz="4" w:space="4" w:color="auto"/>
+        </w:pBdr>
+        <w:ind w:left="1080" w:firstLine="0"/>
+      </w:pPr>
+      <w:r>
+        <w:t>        } else {</w:t>
+      </w:r>
+    </w:p>
+    <w:p>
+      <w:pPr>
+        <w:pBdr>
+          <w:top w:val="single" w:sz="4" w:space="1" w:color="auto"/>
+          <w:left w:val="single" w:sz="4" w:space="4" w:color="auto"/>
+          <w:bottom w:val="single" w:sz="4" w:space="1" w:color="auto"/>
+          <w:right w:val="single" w:sz="4" w:space="4" w:color="auto"/>
+        </w:pBdr>
+        <w:ind w:left="1080" w:firstLine="0"/>
+      </w:pPr>
+      <w:r>
+        <w:t xml:space="preserve">            </w:t>
+      </w:r>
+      <w:proofErr w:type="spellStart"/>
+      <w:r>
+        <w:t>System.out.println</w:t>
+      </w:r>
+      <w:proofErr w:type="spellEnd"/>
+      <w:r>
+        <w:t>(string2</w:t>
+      </w:r>
+      <w:proofErr w:type="gramStart"/>
+      <w:r>
+        <w:t>);</w:t>
+      </w:r>
+      <w:proofErr w:type="gramEnd"/>
+    </w:p>
+    <w:p>
+      <w:pPr>
+        <w:pBdr>
+          <w:top w:val="single" w:sz="4" w:space="1" w:color="auto"/>
+          <w:left w:val="single" w:sz="4" w:space="4" w:color="auto"/>
+          <w:bottom w:val="single" w:sz="4" w:space="1" w:color="auto"/>
+          <w:right w:val="single" w:sz="4" w:space="4" w:color="auto"/>
+        </w:pBdr>
+        <w:ind w:left="1080" w:firstLine="0"/>
+      </w:pPr>
+      <w:r>
+        <w:t xml:space="preserve">            </w:t>
+      </w:r>
+      <w:proofErr w:type="spellStart"/>
+      <w:r>
+        <w:t>System.out.println</w:t>
+      </w:r>
+      <w:proofErr w:type="spellEnd"/>
+      <w:r>
+        <w:t>(string1</w:t>
+      </w:r>
+      <w:proofErr w:type="gramStart"/>
+      <w:r>
+        <w:t>);</w:t>
+      </w:r>
+      <w:proofErr w:type="gramEnd"/>
+    </w:p>
+    <w:p>
+      <w:pPr>
+        <w:pBdr>
+          <w:top w:val="single" w:sz="4" w:space="1" w:color="auto"/>
+          <w:left w:val="single" w:sz="4" w:space="4" w:color="auto"/>
+          <w:bottom w:val="single" w:sz="4" w:space="1" w:color="auto"/>
+          <w:right w:val="single" w:sz="4" w:space="4" w:color="auto"/>
+        </w:pBdr>
+        <w:ind w:left="1080" w:firstLine="0"/>
+      </w:pPr>
+      <w:r>
+        <w:t>        }</w:t>
+      </w:r>
+    </w:p>
+    <w:p>
+      <w:pPr>
+        <w:pBdr>
+          <w:top w:val="single" w:sz="4" w:space="1" w:color="auto"/>
+          <w:left w:val="single" w:sz="4" w:space="4" w:color="auto"/>
+          <w:bottom w:val="single" w:sz="4" w:space="1" w:color="auto"/>
+          <w:right w:val="single" w:sz="4" w:space="4" w:color="auto"/>
+        </w:pBdr>
+        <w:ind w:left="1080" w:firstLine="0"/>
+      </w:pPr>
+    </w:p>
+    <w:p>
+      <w:pPr>
+        <w:pBdr>
+          <w:top w:val="single" w:sz="4" w:space="1" w:color="auto"/>
+          <w:left w:val="single" w:sz="4" w:space="4" w:color="auto"/>
+          <w:bottom w:val="single" w:sz="4" w:space="1" w:color="auto"/>
+          <w:right w:val="single" w:sz="4" w:space="4" w:color="auto"/>
+        </w:pBdr>
+        <w:ind w:left="1080" w:firstLine="0"/>
+      </w:pPr>
+      <w:r>
+        <w:t xml:space="preserve">        </w:t>
+      </w:r>
+      <w:proofErr w:type="spellStart"/>
+      <w:proofErr w:type="gramStart"/>
+      <w:r>
+        <w:t>input.close</w:t>
+      </w:r>
+      <w:proofErr w:type="spellEnd"/>
+      <w:proofErr w:type="gramEnd"/>
+      <w:r>
+        <w:t>(</w:t>
+      </w:r>
+      <w:proofErr w:type="gramStart"/>
+      <w:r>
+        <w:t>);</w:t>
+      </w:r>
+      <w:proofErr w:type="gramEnd"/>
+    </w:p>
+    <w:p>
+      <w:pPr>
+        <w:pBdr>
+          <w:top w:val="single" w:sz="4" w:space="1" w:color="auto"/>
+          <w:left w:val="single" w:sz="4" w:space="4" w:color="auto"/>
+          <w:bottom w:val="single" w:sz="4" w:space="1" w:color="auto"/>
+          <w:right w:val="single" w:sz="4" w:space="4" w:color="auto"/>
+        </w:pBdr>
+        <w:ind w:left="1080" w:firstLine="0"/>
+      </w:pPr>
+      <w:r>
+        <w:t>    }</w:t>
+      </w:r>
+    </w:p>
+    <w:p>
+      <w:pPr>
+        <w:pBdr>
+          <w:top w:val="single" w:sz="4" w:space="1" w:color="auto"/>
+          <w:left w:val="single" w:sz="4" w:space="4" w:color="auto"/>
+          <w:bottom w:val="single" w:sz="4" w:space="1" w:color="auto"/>
+          <w:right w:val="single" w:sz="4" w:space="4" w:color="auto"/>
+        </w:pBdr>
+        <w:ind w:left="1080" w:firstLine="0"/>
+      </w:pPr>
+      <w:r>
+        <w:t>}</w:t>
+      </w:r>
+    </w:p>
+    <w:p>
+      <w:pPr>
+        <w:ind w:left="1080" w:firstLine="0"/>
+      </w:pPr>
     </w:p>
     <w:p>
       <w:pPr>
@@ -428,7 +1384,7 @@
         <w:pBdr>
           <w:top w:val="single" w:sz="4" w:space="1" w:color="auto"/>
           <w:left w:val="single" w:sz="4" w:space="4" w:color="auto"/>
-          <w:bottom w:val="single" w:sz="4" w:space="1" w:color="auto"/>
+          <w:bottom w:val="single" w:sz="4" w:space="0" w:color="auto"/>
           <w:right w:val="single" w:sz="4" w:space="4" w:color="auto"/>
         </w:pBdr>
         <w:spacing w:after="0" w:line="259" w:lineRule="auto"/>
@@ -453,7 +1409,7 @@
         <w:pBdr>
           <w:top w:val="single" w:sz="4" w:space="1" w:color="auto"/>
           <w:left w:val="single" w:sz="4" w:space="4" w:color="auto"/>
-          <w:bottom w:val="single" w:sz="4" w:space="1" w:color="auto"/>
+          <w:bottom w:val="single" w:sz="4" w:space="0" w:color="auto"/>
           <w:right w:val="single" w:sz="4" w:space="4" w:color="auto"/>
         </w:pBdr>
         <w:spacing w:after="0" w:line="259" w:lineRule="auto"/>
@@ -468,7 +1424,7 @@
         <w:pBdr>
           <w:top w:val="single" w:sz="4" w:space="1" w:color="auto"/>
           <w:left w:val="single" w:sz="4" w:space="4" w:color="auto"/>
-          <w:bottom w:val="single" w:sz="4" w:space="1" w:color="auto"/>
+          <w:bottom w:val="single" w:sz="4" w:space="0" w:color="auto"/>
           <w:right w:val="single" w:sz="4" w:space="4" w:color="auto"/>
         </w:pBdr>
         <w:spacing w:after="0" w:line="259" w:lineRule="auto"/>
@@ -491,7 +1447,7 @@
         <w:pBdr>
           <w:top w:val="single" w:sz="4" w:space="1" w:color="auto"/>
           <w:left w:val="single" w:sz="4" w:space="4" w:color="auto"/>
-          <w:bottom w:val="single" w:sz="4" w:space="1" w:color="auto"/>
+          <w:bottom w:val="single" w:sz="4" w:space="0" w:color="auto"/>
           <w:right w:val="single" w:sz="4" w:space="4" w:color="auto"/>
         </w:pBdr>
         <w:spacing w:after="0" w:line="259" w:lineRule="auto"/>
@@ -506,7 +1462,7 @@
         <w:pBdr>
           <w:top w:val="single" w:sz="4" w:space="1" w:color="auto"/>
           <w:left w:val="single" w:sz="4" w:space="4" w:color="auto"/>
-          <w:bottom w:val="single" w:sz="4" w:space="1" w:color="auto"/>
+          <w:bottom w:val="single" w:sz="4" w:space="0" w:color="auto"/>
           <w:right w:val="single" w:sz="4" w:space="4" w:color="auto"/>
         </w:pBdr>
         <w:spacing w:after="0" w:line="259" w:lineRule="auto"/>
@@ -521,7 +1477,7 @@
         <w:pBdr>
           <w:top w:val="single" w:sz="4" w:space="1" w:color="auto"/>
           <w:left w:val="single" w:sz="4" w:space="4" w:color="auto"/>
-          <w:bottom w:val="single" w:sz="4" w:space="1" w:color="auto"/>
+          <w:bottom w:val="single" w:sz="4" w:space="0" w:color="auto"/>
           <w:right w:val="single" w:sz="4" w:space="4" w:color="auto"/>
         </w:pBdr>
         <w:spacing w:after="0" w:line="259" w:lineRule="auto"/>
@@ -544,60 +1500,7 @@
         <w:pBdr>
           <w:top w:val="single" w:sz="4" w:space="1" w:color="auto"/>
           <w:left w:val="single" w:sz="4" w:space="4" w:color="auto"/>
-          <w:bottom w:val="single" w:sz="4" w:space="1" w:color="auto"/>
-          <w:right w:val="single" w:sz="4" w:space="4" w:color="auto"/>
-        </w:pBdr>
-        <w:spacing w:after="0" w:line="259" w:lineRule="auto"/>
-        <w:ind w:left="1080" w:firstLine="0"/>
-      </w:pPr>
-      <w:r>
-        <w:t>        break;</w:t>
-      </w:r>
-    </w:p>
-    <w:p>
-      <w:pPr>
-        <w:pBdr>
-          <w:top w:val="single" w:sz="4" w:space="1" w:color="auto"/>
-          <w:left w:val="single" w:sz="4" w:space="4" w:color="auto"/>
-          <w:bottom w:val="single" w:sz="4" w:space="1" w:color="auto"/>
-          <w:right w:val="single" w:sz="4" w:space="4" w:color="auto"/>
-        </w:pBdr>
-        <w:spacing w:after="0" w:line="259" w:lineRule="auto"/>
-        <w:ind w:left="1080" w:firstLine="0"/>
-      </w:pPr>
-      <w:r>
-        <w:t>    case 2:</w:t>
-      </w:r>
-    </w:p>
-    <w:p>
-      <w:pPr>
-        <w:pBdr>
-          <w:top w:val="single" w:sz="4" w:space="1" w:color="auto"/>
-          <w:left w:val="single" w:sz="4" w:space="4" w:color="auto"/>
-          <w:bottom w:val="single" w:sz="4" w:space="1" w:color="auto"/>
-          <w:right w:val="single" w:sz="4" w:space="4" w:color="auto"/>
-        </w:pBdr>
-        <w:spacing w:after="0" w:line="259" w:lineRule="auto"/>
-        <w:ind w:left="1080" w:firstLine="0"/>
-      </w:pPr>
-      <w:r>
-        <w:t xml:space="preserve">        </w:t>
-      </w:r>
-      <w:proofErr w:type="spellStart"/>
-      <w:r>
-        <w:t>System.out.println</w:t>
-      </w:r>
-      <w:proofErr w:type="spellEnd"/>
-      <w:r>
-        <w:t>("Tuesday");</w:t>
-      </w:r>
-    </w:p>
-    <w:p>
-      <w:pPr>
-        <w:pBdr>
-          <w:top w:val="single" w:sz="4" w:space="1" w:color="auto"/>
-          <w:left w:val="single" w:sz="4" w:space="4" w:color="auto"/>
-          <w:bottom w:val="single" w:sz="4" w:space="1" w:color="auto"/>
+          <w:bottom w:val="single" w:sz="4" w:space="0" w:color="auto"/>
           <w:right w:val="single" w:sz="4" w:space="4" w:color="auto"/>
         </w:pBdr>
         <w:spacing w:after="0" w:line="259" w:lineRule="auto"/>
@@ -613,7 +1516,60 @@
         <w:pBdr>
           <w:top w:val="single" w:sz="4" w:space="1" w:color="auto"/>
           <w:left w:val="single" w:sz="4" w:space="4" w:color="auto"/>
-          <w:bottom w:val="single" w:sz="4" w:space="1" w:color="auto"/>
+          <w:bottom w:val="single" w:sz="4" w:space="0" w:color="auto"/>
+          <w:right w:val="single" w:sz="4" w:space="4" w:color="auto"/>
+        </w:pBdr>
+        <w:spacing w:after="0" w:line="259" w:lineRule="auto"/>
+        <w:ind w:left="1080" w:firstLine="0"/>
+      </w:pPr>
+      <w:r>
+        <w:t>    case 2:</w:t>
+      </w:r>
+    </w:p>
+    <w:p>
+      <w:pPr>
+        <w:pBdr>
+          <w:top w:val="single" w:sz="4" w:space="1" w:color="auto"/>
+          <w:left w:val="single" w:sz="4" w:space="4" w:color="auto"/>
+          <w:bottom w:val="single" w:sz="4" w:space="0" w:color="auto"/>
+          <w:right w:val="single" w:sz="4" w:space="4" w:color="auto"/>
+        </w:pBdr>
+        <w:spacing w:after="0" w:line="259" w:lineRule="auto"/>
+        <w:ind w:left="1080" w:firstLine="0"/>
+      </w:pPr>
+      <w:r>
+        <w:t xml:space="preserve">        </w:t>
+      </w:r>
+      <w:proofErr w:type="spellStart"/>
+      <w:r>
+        <w:t>System.out.println</w:t>
+      </w:r>
+      <w:proofErr w:type="spellEnd"/>
+      <w:r>
+        <w:t>("Tuesday");</w:t>
+      </w:r>
+    </w:p>
+    <w:p>
+      <w:pPr>
+        <w:pBdr>
+          <w:top w:val="single" w:sz="4" w:space="1" w:color="auto"/>
+          <w:left w:val="single" w:sz="4" w:space="4" w:color="auto"/>
+          <w:bottom w:val="single" w:sz="4" w:space="0" w:color="auto"/>
+          <w:right w:val="single" w:sz="4" w:space="4" w:color="auto"/>
+        </w:pBdr>
+        <w:spacing w:after="0" w:line="259" w:lineRule="auto"/>
+        <w:ind w:left="1080" w:firstLine="0"/>
+      </w:pPr>
+      <w:r>
+        <w:t>        break;</w:t>
+      </w:r>
+    </w:p>
+    <w:p>
+      <w:pPr>
+        <w:pBdr>
+          <w:top w:val="single" w:sz="4" w:space="1" w:color="auto"/>
+          <w:left w:val="single" w:sz="4" w:space="4" w:color="auto"/>
+          <w:bottom w:val="single" w:sz="4" w:space="0" w:color="auto"/>
           <w:right w:val="single" w:sz="4" w:space="4" w:color="auto"/>
         </w:pBdr>
         <w:spacing w:after="0" w:line="259" w:lineRule="auto"/>
@@ -628,7 +1584,7 @@
         <w:pBdr>
           <w:top w:val="single" w:sz="4" w:space="1" w:color="auto"/>
           <w:left w:val="single" w:sz="4" w:space="4" w:color="auto"/>
-          <w:bottom w:val="single" w:sz="4" w:space="1" w:color="auto"/>
+          <w:bottom w:val="single" w:sz="4" w:space="0" w:color="auto"/>
           <w:right w:val="single" w:sz="4" w:space="4" w:color="auto"/>
         </w:pBdr>
         <w:spacing w:after="0" w:line="259" w:lineRule="auto"/>
@@ -651,7 +1607,7 @@
         <w:pBdr>
           <w:top w:val="single" w:sz="4" w:space="1" w:color="auto"/>
           <w:left w:val="single" w:sz="4" w:space="4" w:color="auto"/>
-          <w:bottom w:val="single" w:sz="4" w:space="1" w:color="auto"/>
+          <w:bottom w:val="single" w:sz="4" w:space="0" w:color="auto"/>
           <w:right w:val="single" w:sz="4" w:space="4" w:color="auto"/>
         </w:pBdr>
         <w:spacing w:after="0" w:line="259" w:lineRule="auto"/>
@@ -666,7 +1622,7 @@
         <w:pBdr>
           <w:top w:val="single" w:sz="4" w:space="1" w:color="auto"/>
           <w:left w:val="single" w:sz="4" w:space="4" w:color="auto"/>
-          <w:bottom w:val="single" w:sz="4" w:space="1" w:color="auto"/>
+          <w:bottom w:val="single" w:sz="4" w:space="0" w:color="auto"/>
           <w:right w:val="single" w:sz="4" w:space="4" w:color="auto"/>
         </w:pBdr>
         <w:spacing w:after="0" w:line="259" w:lineRule="auto"/>
@@ -681,7 +1637,7 @@
         <w:pBdr>
           <w:top w:val="single" w:sz="4" w:space="1" w:color="auto"/>
           <w:left w:val="single" w:sz="4" w:space="4" w:color="auto"/>
-          <w:bottom w:val="single" w:sz="4" w:space="1" w:color="auto"/>
+          <w:bottom w:val="single" w:sz="4" w:space="0" w:color="auto"/>
           <w:right w:val="single" w:sz="4" w:space="4" w:color="auto"/>
         </w:pBdr>
         <w:spacing w:after="0" w:line="259" w:lineRule="auto"/>
@@ -704,7 +1660,7 @@
         <w:pBdr>
           <w:top w:val="single" w:sz="4" w:space="1" w:color="auto"/>
           <w:left w:val="single" w:sz="4" w:space="4" w:color="auto"/>
-          <w:bottom w:val="single" w:sz="4" w:space="1" w:color="auto"/>
+          <w:bottom w:val="single" w:sz="4" w:space="0" w:color="auto"/>
           <w:right w:val="single" w:sz="4" w:space="4" w:color="auto"/>
         </w:pBdr>
         <w:spacing w:after="0" w:line="259" w:lineRule="auto"/>
@@ -719,7 +1675,7 @@
         <w:pBdr>
           <w:top w:val="single" w:sz="4" w:space="1" w:color="auto"/>
           <w:left w:val="single" w:sz="4" w:space="4" w:color="auto"/>
-          <w:bottom w:val="single" w:sz="4" w:space="1" w:color="auto"/>
+          <w:bottom w:val="single" w:sz="4" w:space="0" w:color="auto"/>
           <w:right w:val="single" w:sz="4" w:space="4" w:color="auto"/>
         </w:pBdr>
         <w:spacing w:after="0" w:line="259" w:lineRule="auto"/>
@@ -734,7 +1690,7 @@
         <w:pBdr>
           <w:top w:val="single" w:sz="4" w:space="1" w:color="auto"/>
           <w:left w:val="single" w:sz="4" w:space="4" w:color="auto"/>
-          <w:bottom w:val="single" w:sz="4" w:space="1" w:color="auto"/>
+          <w:bottom w:val="single" w:sz="4" w:space="0" w:color="auto"/>
           <w:right w:val="single" w:sz="4" w:space="4" w:color="auto"/>
         </w:pBdr>
         <w:spacing w:after="0" w:line="259" w:lineRule="auto"/>
@@ -757,7 +1713,7 @@
         <w:pBdr>
           <w:top w:val="single" w:sz="4" w:space="1" w:color="auto"/>
           <w:left w:val="single" w:sz="4" w:space="4" w:color="auto"/>
-          <w:bottom w:val="single" w:sz="4" w:space="1" w:color="auto"/>
+          <w:bottom w:val="single" w:sz="4" w:space="0" w:color="auto"/>
           <w:right w:val="single" w:sz="4" w:space="4" w:color="auto"/>
         </w:pBdr>
         <w:spacing w:after="0" w:line="259" w:lineRule="auto"/>
@@ -772,7 +1728,7 @@
         <w:pBdr>
           <w:top w:val="single" w:sz="4" w:space="1" w:color="auto"/>
           <w:left w:val="single" w:sz="4" w:space="4" w:color="auto"/>
-          <w:bottom w:val="single" w:sz="4" w:space="1" w:color="auto"/>
+          <w:bottom w:val="single" w:sz="4" w:space="0" w:color="auto"/>
           <w:right w:val="single" w:sz="4" w:space="4" w:color="auto"/>
         </w:pBdr>
         <w:spacing w:after="0" w:line="259" w:lineRule="auto"/>
@@ -787,7 +1743,7 @@
         <w:pBdr>
           <w:top w:val="single" w:sz="4" w:space="1" w:color="auto"/>
           <w:left w:val="single" w:sz="4" w:space="4" w:color="auto"/>
-          <w:bottom w:val="single" w:sz="4" w:space="1" w:color="auto"/>
+          <w:bottom w:val="single" w:sz="4" w:space="0" w:color="auto"/>
           <w:right w:val="single" w:sz="4" w:space="4" w:color="auto"/>
         </w:pBdr>
         <w:spacing w:after="0" w:line="259" w:lineRule="auto"/>
@@ -810,7 +1766,7 @@
         <w:pBdr>
           <w:top w:val="single" w:sz="4" w:space="1" w:color="auto"/>
           <w:left w:val="single" w:sz="4" w:space="4" w:color="auto"/>
-          <w:bottom w:val="single" w:sz="4" w:space="1" w:color="auto"/>
+          <w:bottom w:val="single" w:sz="4" w:space="0" w:color="auto"/>
           <w:right w:val="single" w:sz="4" w:space="4" w:color="auto"/>
         </w:pBdr>
         <w:spacing w:after="0" w:line="259" w:lineRule="auto"/>
@@ -825,7 +1781,7 @@
         <w:pBdr>
           <w:top w:val="single" w:sz="4" w:space="1" w:color="auto"/>
           <w:left w:val="single" w:sz="4" w:space="4" w:color="auto"/>
-          <w:bottom w:val="single" w:sz="4" w:space="1" w:color="auto"/>
+          <w:bottom w:val="single" w:sz="4" w:space="0" w:color="auto"/>
           <w:right w:val="single" w:sz="4" w:space="4" w:color="auto"/>
         </w:pBdr>
         <w:spacing w:after="0" w:line="259" w:lineRule="auto"/>
@@ -1182,6 +2138,7 @@
         <w:ind w:left="1080" w:right="415" w:firstLine="0"/>
       </w:pPr>
       <w:r>
+        <w:lastRenderedPageBreak/>
         <w:t>else</w:t>
       </w:r>
     </w:p>
@@ -1222,7 +2179,6 @@
         </w:numPr>
       </w:pPr>
       <w:r>
-        <w:lastRenderedPageBreak/>
         <w:br/>
         <w:t xml:space="preserve">if x&gt;0 or y&gt;0; </w:t>
       </w:r>
@@ -1616,6 +2572,7 @@
         <w:ind w:left="1075"/>
       </w:pPr>
       <w:r>
+        <w:lastRenderedPageBreak/>
         <w:t xml:space="preserve">Answer: </w:t>
       </w:r>
     </w:p>
@@ -1637,7 +2594,6 @@
         <w:ind w:left="730"/>
       </w:pPr>
       <w:r>
-        <w:lastRenderedPageBreak/>
         <w:t>d.</w:t>
       </w:r>
       <w:r>
@@ -1714,6 +2670,14 @@
       </w:pPr>
       <w:r>
         <w:t xml:space="preserve">} </w:t>
+      </w:r>
+    </w:p>
+    <w:p>
+      <w:pPr>
+        <w:ind w:left="1075"/>
+      </w:pPr>
+      <w:r>
+        <w:t>Answer: (no output)</w:t>
       </w:r>
     </w:p>
     <w:p>
@@ -1770,12 +2734,17 @@
       </w:r>
       <w:proofErr w:type="gramEnd"/>
       <w:r>
-        <w:t>.Scanner</w:t>
+        <w:t>.</w:t>
+      </w:r>
+      <w:proofErr w:type="gramStart"/>
+      <w:r>
+        <w:t>Scanner</w:t>
       </w:r>
       <w:proofErr w:type="spellEnd"/>
       <w:r>
         <w:t>;</w:t>
       </w:r>
+      <w:proofErr w:type="gramEnd"/>
     </w:p>
     <w:p>
       <w:pPr>
@@ -1857,8 +2826,13 @@
       </w:r>
       <w:proofErr w:type="gramEnd"/>
       <w:r>
-        <w:t>System.in);</w:t>
-      </w:r>
+        <w:t>System.in</w:t>
+      </w:r>
+      <w:proofErr w:type="gramStart"/>
+      <w:r>
+        <w:t>);</w:t>
+      </w:r>
+      <w:proofErr w:type="gramEnd"/>
     </w:p>
     <w:p>
       <w:pPr>
@@ -1905,8 +2879,13 @@
       <w:proofErr w:type="spellEnd"/>
       <w:proofErr w:type="gramEnd"/>
       <w:r>
-        <w:t>();</w:t>
-      </w:r>
+        <w:t>(</w:t>
+      </w:r>
+      <w:proofErr w:type="gramStart"/>
+      <w:r>
+        <w:t>);</w:t>
+      </w:r>
+      <w:proofErr w:type="gramEnd"/>
     </w:p>
     <w:p>
       <w:pPr>
@@ -1930,8 +2909,13 @@
       <w:proofErr w:type="spellEnd"/>
       <w:proofErr w:type="gramEnd"/>
       <w:r>
-        <w:t>();</w:t>
-      </w:r>
+        <w:t>(</w:t>
+      </w:r>
+      <w:proofErr w:type="gramStart"/>
+      <w:r>
+        <w:t>);</w:t>
+      </w:r>
+      <w:proofErr w:type="gramEnd"/>
     </w:p>
     <w:p>
       <w:pPr>
@@ -1955,8 +2939,13 @@
       <w:proofErr w:type="spellEnd"/>
       <w:proofErr w:type="gramEnd"/>
       <w:r>
-        <w:t>();</w:t>
-      </w:r>
+        <w:t>(</w:t>
+      </w:r>
+      <w:proofErr w:type="gramStart"/>
+      <w:r>
+        <w:t>);</w:t>
+      </w:r>
+      <w:proofErr w:type="gramEnd"/>
     </w:p>
     <w:p>
       <w:pPr>
@@ -2314,6 +3303,7 @@
         <w:ind w:left="360" w:firstLine="0"/>
       </w:pPr>
       <w:r>
+        <w:lastRenderedPageBreak/>
         <w:t xml:space="preserve">        </w:t>
       </w:r>
       <w:proofErr w:type="spellStart"/>
@@ -2324,8 +3314,13 @@
       <w:proofErr w:type="spellEnd"/>
       <w:proofErr w:type="gramEnd"/>
       <w:r>
-        <w:t>();</w:t>
-      </w:r>
+        <w:t>(</w:t>
+      </w:r>
+      <w:proofErr w:type="gramStart"/>
+      <w:r>
+        <w:t>);</w:t>
+      </w:r>
+      <w:proofErr w:type="gramEnd"/>
     </w:p>
     <w:p>
       <w:pPr>
@@ -2372,7 +3367,6 @@
         <w:ind w:hanging="360"/>
       </w:pPr>
       <w:r>
-        <w:lastRenderedPageBreak/>
         <w:t xml:space="preserve">Write the java statements that determine whether the Leap year. A Leap year is divisible by 4 but not by 100. However, a Leap year is also divisible by 400. </w:t>
       </w:r>
       <w:r>
@@ -2400,12 +3394,17 @@
       </w:r>
       <w:proofErr w:type="gramEnd"/>
       <w:r>
-        <w:t>.Scanner</w:t>
+        <w:t>.</w:t>
+      </w:r>
+      <w:proofErr w:type="gramStart"/>
+      <w:r>
+        <w:t>Scanner</w:t>
       </w:r>
       <w:proofErr w:type="spellEnd"/>
       <w:r>
         <w:t>;</w:t>
       </w:r>
+      <w:proofErr w:type="gramEnd"/>
     </w:p>
     <w:p>
       <w:pPr>
@@ -2472,8 +3471,13 @@
       </w:r>
       <w:proofErr w:type="gramEnd"/>
       <w:r>
-        <w:t>System.in);</w:t>
-      </w:r>
+        <w:t>System.in</w:t>
+      </w:r>
+      <w:proofErr w:type="gramStart"/>
+      <w:r>
+        <w:t>);</w:t>
+      </w:r>
+      <w:proofErr w:type="gramEnd"/>
     </w:p>
     <w:p>
       <w:pPr>
@@ -2518,8 +3522,13 @@
       <w:proofErr w:type="spellEnd"/>
       <w:proofErr w:type="gramEnd"/>
       <w:r>
-        <w:t>();</w:t>
-      </w:r>
+        <w:t>(</w:t>
+      </w:r>
+      <w:proofErr w:type="gramStart"/>
+      <w:r>
+        <w:t>);</w:t>
+      </w:r>
+      <w:proofErr w:type="gramEnd"/>
     </w:p>
     <w:p>
       <w:pPr>
@@ -2986,8 +3995,13 @@
       <w:proofErr w:type="spellEnd"/>
       <w:proofErr w:type="gramEnd"/>
       <w:r>
-        <w:t>();</w:t>
-      </w:r>
+        <w:t>(</w:t>
+      </w:r>
+      <w:proofErr w:type="gramStart"/>
+      <w:r>
+        <w:t>);</w:t>
+      </w:r>
+      <w:proofErr w:type="gramEnd"/>
     </w:p>
     <w:p>
       <w:pPr>
@@ -3916,6 +4930,29 @@
       <w:contextualSpacing/>
     </w:pPr>
   </w:style>
+  <w:style w:type="character" w:styleId="Hyperlink">
+    <w:name w:val="Hyperlink"/>
+    <w:basedOn w:val="DefaultParagraphFont"/>
+    <w:uiPriority w:val="99"/>
+    <w:unhideWhenUsed/>
+    <w:rsid w:val="00297B33"/>
+    <w:rPr>
+      <w:color w:val="467886" w:themeColor="hyperlink"/>
+      <w:u w:val="single"/>
+    </w:rPr>
+  </w:style>
+  <w:style w:type="character" w:styleId="UnresolvedMention">
+    <w:name w:val="Unresolved Mention"/>
+    <w:basedOn w:val="DefaultParagraphFont"/>
+    <w:uiPriority w:val="99"/>
+    <w:semiHidden/>
+    <w:unhideWhenUsed/>
+    <w:rsid w:val="00297B33"/>
+    <w:rPr>
+      <w:color w:val="605E5C"/>
+      <w:shd w:val="clear" w:color="auto" w:fill="E1DFDD"/>
+    </w:rPr>
+  </w:style>
 </w:styles>
 </file>
 

</xml_diff>